<commit_message>
chore: update EDT documentation files for all modules
Modified EDT documents for phases 4-5 and modules 1-7 including
authentication, therapeutic sessions, appointments, payments,
community, feedback, and virtual meeting room documentation.
</commit_message>
<xml_diff>
--- a/edt/word/00_EDT_Maestra_Cora.docx
+++ b/edt/word/00_EDT_Maestra_Cora.docx
@@ -298,12 +298,7 @@
           </w:tcPr>
           <w:p>
             <w:r>
-              <w:rPr>
-                <w:rFonts w:ascii="Calibri" w:hAnsi="Calibri"/>
-                <w:color w:val="2C3E50"/>
-                <w:sz w:val="22"/>
-              </w:rPr>
-              <w:t>Joan Mora Rojas</w:t>
+              <w:t>Jose Alonso Porras Ramirez</w:t>
             </w:r>
           </w:p>
         </w:tc>
@@ -23130,11 +23125,7 @@
           </w:tcPr>
           <w:p>
             <w:r>
-              <w:rPr>
-                <w:rFonts w:ascii="Calibri" w:hAnsi="Calibri"/>
-                <w:sz w:val="18"/>
-              </w:rPr>
-              <w:t>Joan Mora Rojas</w:t>
+              <w:t>Jose Alonso Porras Ramirez</w:t>
             </w:r>
           </w:p>
         </w:tc>

</xml_diff>